<commit_message>
ZERP-218: change the passport expiry to rvisa expiry
</commit_message>
<xml_diff>
--- a/Documents Generation/noc-syria.docx
+++ b/Documents Generation/noc-syria.docx
@@ -25,12 +25,12 @@
             <wp:extent cx="2842260" cy="597535"/>
             <wp:effectExtent b="0" l="0" r="0" t="0"/>
             <wp:wrapNone/>
-            <wp:docPr id="2" name="image2.png"/>
+            <wp:docPr id="2" name="image1.png"/>
             <a:graphic>
               <a:graphicData uri="http://schemas.openxmlformats.org/drawingml/2006/picture">
                 <pic:pic>
                   <pic:nvPicPr>
-                    <pic:cNvPr id="0" name="image2.png"/>
+                    <pic:cNvPr id="0" name="image1.png"/>
                     <pic:cNvPicPr preferRelativeResize="0"/>
                   </pic:nvPicPr>
                   <pic:blipFill>
@@ -1199,7 +1199,7 @@
           <w:rFonts w:ascii="Arial" w:cs="Arial" w:eastAsia="Arial" w:hAnsi="Arial"/>
           <w:rtl w:val="0"/>
         </w:rPr>
-        <w:t xml:space="preserve">{{maid_passport_expiry}}</w:t>
+        <w:t xml:space="preserve">{{maid_rvisa_expiry}}</w:t>
       </w:r>
       <w:r>
         <w:rPr>
@@ -1729,12 +1729,12 @@
             <wp:extent cx="1243965" cy="1243965"/>
             <wp:effectExtent b="0" l="0" r="0" t="0"/>
             <wp:wrapNone/>
-            <wp:docPr id="3" name="image1.png"/>
+            <wp:docPr id="3" name="image3.png"/>
             <a:graphic>
               <a:graphicData uri="http://schemas.openxmlformats.org/drawingml/2006/picture">
                 <pic:pic>
                   <pic:nvPicPr>
-                    <pic:cNvPr id="0" name="image1.png"/>
+                    <pic:cNvPr id="0" name="image3.png"/>
                     <pic:cNvPicPr preferRelativeResize="0"/>
                   </pic:nvPicPr>
                   <pic:blipFill>
@@ -1771,12 +1771,12 @@
             <wp:extent cx="1036320" cy="944880"/>
             <wp:effectExtent b="0" l="0" r="0" t="0"/>
             <wp:wrapNone/>
-            <wp:docPr id="1" name="image3.png"/>
+            <wp:docPr id="1" name="image2.png"/>
             <a:graphic>
               <a:graphicData uri="http://schemas.openxmlformats.org/drawingml/2006/picture">
                 <pic:pic>
                   <pic:nvPicPr>
-                    <pic:cNvPr id="0" name="image3.png"/>
+                    <pic:cNvPr id="0" name="image2.png"/>
                     <pic:cNvPicPr preferRelativeResize="0"/>
                   </pic:nvPicPr>
                   <pic:blipFill>

</xml_diff>